<commit_message>
Correct CV body text to justified alignment
</commit_message>
<xml_diff>
--- a/dist/assets/documents/Krystyna-Mishchenko-CV-DE.docx
+++ b/dist/assets/documents/Krystyna-Mishchenko-CV-DE.docx
@@ -47,6 +47,7 @@
           <w:p>
             <w:pPr>
               <w:spacing w:after="60"/>
+              <w:jc w:val="left"/>
             </w:pPr>
             <w:r>
               <w:rPr>
@@ -60,6 +61,7 @@
           <w:p>
             <w:pPr>
               <w:spacing w:after="60"/>
+              <w:jc w:val="left"/>
             </w:pPr>
             <w:r>
               <w:rPr>
@@ -110,6 +112,7 @@
           <w:p>
             <w:pPr>
               <w:spacing w:after="100" w:line="254" w:lineRule="auto"/>
+              <w:jc w:val="right"/>
             </w:pPr>
             <w:r>
               <w:rPr>
@@ -128,6 +131,7 @@
           <w:p>
             <w:pPr>
               <w:spacing w:after="100" w:line="254" w:lineRule="auto"/>
+              <w:jc w:val="both"/>
             </w:pPr>
             <w:r>
               <w:rPr>
@@ -149,6 +153,7 @@
           <w:p>
             <w:pPr>
               <w:spacing w:after="100" w:line="254" w:lineRule="auto"/>
+              <w:jc w:val="right"/>
             </w:pPr>
             <w:r>
               <w:rPr>
@@ -167,6 +172,7 @@
           <w:p>
             <w:pPr>
               <w:spacing w:after="100" w:line="254" w:lineRule="auto"/>
+              <w:jc w:val="both"/>
             </w:pPr>
             <w:r>
               <w:rPr>
@@ -188,6 +194,7 @@
           <w:p>
             <w:pPr>
               <w:spacing w:after="100" w:line="254" w:lineRule="auto"/>
+              <w:jc w:val="right"/>
             </w:pPr>
             <w:r>
               <w:rPr>
@@ -206,6 +213,7 @@
           <w:p>
             <w:pPr>
               <w:spacing w:after="100" w:line="254" w:lineRule="auto"/>
+              <w:jc w:val="both"/>
             </w:pPr>
             <w:r>
               <w:rPr>
@@ -259,6 +267,7 @@
           <w:p>
             <w:pPr>
               <w:spacing w:after="100" w:line="254" w:lineRule="auto"/>
+              <w:jc w:val="right"/>
             </w:pPr>
             <w:r>
               <w:rPr>
@@ -277,6 +286,7 @@
           <w:p>
             <w:pPr>
               <w:spacing w:after="100" w:line="254" w:lineRule="auto"/>
+              <w:jc w:val="both"/>
             </w:pPr>
             <w:r>
               <w:rPr>
@@ -317,6 +327,7 @@
           <w:p>
             <w:pPr>
               <w:spacing w:after="100" w:line="254" w:lineRule="auto"/>
+              <w:jc w:val="right"/>
             </w:pPr>
             <w:r>
               <w:rPr>
@@ -335,6 +346,7 @@
           <w:p>
             <w:pPr>
               <w:spacing w:after="100" w:line="254" w:lineRule="auto"/>
+              <w:jc w:val="both"/>
             </w:pPr>
             <w:r>
               <w:rPr>
@@ -356,6 +368,7 @@
           <w:p>
             <w:pPr>
               <w:spacing w:after="100" w:line="254" w:lineRule="auto"/>
+              <w:jc w:val="right"/>
             </w:pPr>
             <w:r>
               <w:rPr>
@@ -374,6 +387,7 @@
           <w:p>
             <w:pPr>
               <w:spacing w:after="100" w:line="254" w:lineRule="auto"/>
+              <w:jc w:val="both"/>
             </w:pPr>
             <w:r>
               <w:rPr>
@@ -395,6 +409,7 @@
           <w:p>
             <w:pPr>
               <w:spacing w:after="100" w:line="254" w:lineRule="auto"/>
+              <w:jc w:val="right"/>
             </w:pPr>
             <w:r>
               <w:rPr>
@@ -413,6 +428,7 @@
           <w:p>
             <w:pPr>
               <w:spacing w:after="100" w:line="254" w:lineRule="auto"/>
+              <w:jc w:val="both"/>
             </w:pPr>
             <w:r>
               <w:rPr>
@@ -434,6 +450,7 @@
           <w:p>
             <w:pPr>
               <w:spacing w:after="100" w:line="254" w:lineRule="auto"/>
+              <w:jc w:val="right"/>
             </w:pPr>
             <w:r>
               <w:rPr>
@@ -452,6 +469,7 @@
           <w:p>
             <w:pPr>
               <w:spacing w:after="100" w:line="254" w:lineRule="auto"/>
+              <w:jc w:val="both"/>
             </w:pPr>
             <w:r>
               <w:rPr>
@@ -473,6 +491,7 @@
           <w:p>
             <w:pPr>
               <w:spacing w:after="100" w:line="254" w:lineRule="auto"/>
+              <w:jc w:val="right"/>
             </w:pPr>
             <w:r>
               <w:rPr>
@@ -491,6 +510,7 @@
           <w:p>
             <w:pPr>
               <w:spacing w:after="100" w:line="254" w:lineRule="auto"/>
+              <w:jc w:val="both"/>
             </w:pPr>
             <w:r>
               <w:rPr>
@@ -544,6 +564,7 @@
           <w:p>
             <w:pPr>
               <w:spacing w:after="100" w:line="254" w:lineRule="auto"/>
+              <w:jc w:val="right"/>
             </w:pPr>
             <w:r>
               <w:rPr>
@@ -562,6 +583,7 @@
           <w:p>
             <w:pPr>
               <w:spacing w:after="100" w:line="254" w:lineRule="auto"/>
+              <w:jc w:val="both"/>
             </w:pPr>
             <w:r>
               <w:rPr>
@@ -583,6 +605,7 @@
           <w:p>
             <w:pPr>
               <w:spacing w:after="100" w:line="254" w:lineRule="auto"/>
+              <w:jc w:val="right"/>
             </w:pPr>
             <w:r>
               <w:rPr>
@@ -601,6 +624,7 @@
           <w:p>
             <w:pPr>
               <w:spacing w:after="100" w:line="254" w:lineRule="auto"/>
+              <w:jc w:val="both"/>
             </w:pPr>
             <w:r>
               <w:rPr>
@@ -622,6 +646,7 @@
           <w:p>
             <w:pPr>
               <w:spacing w:after="100" w:line="254" w:lineRule="auto"/>
+              <w:jc w:val="right"/>
             </w:pPr>
             <w:r>
               <w:rPr>
@@ -640,6 +665,7 @@
           <w:p>
             <w:pPr>
               <w:spacing w:after="100" w:line="254" w:lineRule="auto"/>
+              <w:jc w:val="both"/>
             </w:pPr>
             <w:r>
               <w:rPr>
@@ -661,6 +687,7 @@
           <w:p>
             <w:pPr>
               <w:spacing w:after="100" w:line="254" w:lineRule="auto"/>
+              <w:jc w:val="right"/>
             </w:pPr>
             <w:r>
               <w:rPr>
@@ -679,6 +706,7 @@
           <w:p>
             <w:pPr>
               <w:spacing w:after="100" w:line="254" w:lineRule="auto"/>
+              <w:jc w:val="both"/>
             </w:pPr>
             <w:r>
               <w:rPr>
@@ -700,6 +728,7 @@
           <w:p>
             <w:pPr>
               <w:spacing w:after="100" w:line="254" w:lineRule="auto"/>
+              <w:jc w:val="right"/>
             </w:pPr>
             <w:r>
               <w:rPr>
@@ -718,6 +747,7 @@
           <w:p>
             <w:pPr>
               <w:spacing w:after="100" w:line="254" w:lineRule="auto"/>
+              <w:jc w:val="both"/>
             </w:pPr>
             <w:r>
               <w:rPr>
@@ -739,6 +769,7 @@
           <w:p>
             <w:pPr>
               <w:spacing w:after="100" w:line="254" w:lineRule="auto"/>
+              <w:jc w:val="right"/>
             </w:pPr>
             <w:r>
               <w:rPr>
@@ -757,6 +788,7 @@
           <w:p>
             <w:pPr>
               <w:spacing w:after="100" w:line="254" w:lineRule="auto"/>
+              <w:jc w:val="both"/>
             </w:pPr>
             <w:r>
               <w:rPr>
@@ -778,6 +810,7 @@
           <w:p>
             <w:pPr>
               <w:spacing w:after="100" w:line="254" w:lineRule="auto"/>
+              <w:jc w:val="right"/>
             </w:pPr>
             <w:r>
               <w:rPr>
@@ -796,6 +829,7 @@
           <w:p>
             <w:pPr>
               <w:spacing w:after="100" w:line="254" w:lineRule="auto"/>
+              <w:jc w:val="both"/>
             </w:pPr>
             <w:r>
               <w:rPr>
@@ -817,6 +851,7 @@
           <w:p>
             <w:pPr>
               <w:spacing w:after="100" w:line="254" w:lineRule="auto"/>
+              <w:jc w:val="right"/>
             </w:pPr>
             <w:r>
               <w:rPr>
@@ -835,6 +870,7 @@
           <w:p>
             <w:pPr>
               <w:spacing w:after="100" w:line="254" w:lineRule="auto"/>
+              <w:jc w:val="both"/>
             </w:pPr>
             <w:r>
               <w:rPr>
@@ -875,6 +911,7 @@
           <w:p>
             <w:pPr>
               <w:spacing w:after="100" w:line="254" w:lineRule="auto"/>
+              <w:jc w:val="right"/>
             </w:pPr>
             <w:r>
               <w:rPr>
@@ -893,6 +930,7 @@
           <w:p>
             <w:pPr>
               <w:spacing w:after="100" w:line="254" w:lineRule="auto"/>
+              <w:jc w:val="both"/>
             </w:pPr>
             <w:r>
               <w:rPr>
@@ -914,6 +952,7 @@
           <w:p>
             <w:pPr>
               <w:spacing w:after="100" w:line="254" w:lineRule="auto"/>
+              <w:jc w:val="right"/>
             </w:pPr>
             <w:r>
               <w:rPr>
@@ -932,6 +971,7 @@
           <w:p>
             <w:pPr>
               <w:spacing w:after="100" w:line="254" w:lineRule="auto"/>
+              <w:jc w:val="both"/>
             </w:pPr>
             <w:r>
               <w:rPr>
@@ -953,6 +993,7 @@
           <w:p>
             <w:pPr>
               <w:spacing w:after="100" w:line="254" w:lineRule="auto"/>
+              <w:jc w:val="right"/>
             </w:pPr>
             <w:r>
               <w:rPr>
@@ -971,6 +1012,7 @@
           <w:p>
             <w:pPr>
               <w:spacing w:after="100" w:line="254" w:lineRule="auto"/>
+              <w:jc w:val="both"/>
             </w:pPr>
             <w:r>
               <w:rPr>
@@ -992,6 +1034,7 @@
           <w:p>
             <w:pPr>
               <w:spacing w:after="100" w:line="254" w:lineRule="auto"/>
+              <w:jc w:val="right"/>
             </w:pPr>
             <w:r>
               <w:rPr>
@@ -1010,6 +1053,7 @@
           <w:p>
             <w:pPr>
               <w:spacing w:after="100" w:line="254" w:lineRule="auto"/>
+              <w:jc w:val="both"/>
             </w:pPr>
             <w:r>
               <w:rPr>
@@ -1031,6 +1075,7 @@
           <w:p>
             <w:pPr>
               <w:spacing w:after="100" w:line="254" w:lineRule="auto"/>
+              <w:jc w:val="right"/>
             </w:pPr>
             <w:r>
               <w:rPr>
@@ -1049,6 +1094,7 @@
           <w:p>
             <w:pPr>
               <w:spacing w:after="100" w:line="254" w:lineRule="auto"/>
+              <w:jc w:val="both"/>
             </w:pPr>
             <w:r>
               <w:rPr>
@@ -1089,6 +1135,7 @@
           <w:p>
             <w:pPr>
               <w:spacing w:after="100" w:line="254" w:lineRule="auto"/>
+              <w:jc w:val="right"/>
             </w:pPr>
             <w:r>
               <w:rPr>
@@ -1107,6 +1154,7 @@
           <w:p>
             <w:pPr>
               <w:spacing w:after="100" w:line="254" w:lineRule="auto"/>
+              <w:jc w:val="both"/>
             </w:pPr>
             <w:r>
               <w:rPr>
@@ -1128,6 +1176,7 @@
           <w:p>
             <w:pPr>
               <w:spacing w:after="100" w:line="254" w:lineRule="auto"/>
+              <w:jc w:val="right"/>
             </w:pPr>
             <w:r>
               <w:rPr>
@@ -1146,6 +1195,7 @@
           <w:p>
             <w:pPr>
               <w:spacing w:after="100" w:line="254" w:lineRule="auto"/>
+              <w:jc w:val="both"/>
             </w:pPr>
             <w:r>
               <w:rPr>
@@ -1167,6 +1217,7 @@
           <w:p>
             <w:pPr>
               <w:spacing w:after="100" w:line="254" w:lineRule="auto"/>
+              <w:jc w:val="right"/>
             </w:pPr>
             <w:r>
               <w:rPr>
@@ -1185,6 +1236,7 @@
           <w:p>
             <w:pPr>
               <w:spacing w:after="100" w:line="254" w:lineRule="auto"/>
+              <w:jc w:val="both"/>
             </w:pPr>
             <w:r>
               <w:rPr>
@@ -1220,7 +1272,7 @@
           </w:tcPr>
           <w:p>
             <w:pPr>
-              <w:jc w:val="right"/>
+              <w:jc w:val="left"/>
             </w:pPr>
             <w:r>
               <w:t>Ukrainisch — Muttersprache</w:t>
@@ -1233,7 +1285,7 @@
           </w:tcPr>
           <w:p>
             <w:pPr>
-              <w:jc w:val="right"/>
+              <w:jc w:val="left"/>
             </w:pPr>
             <w:r>
               <w:t>Russisch — muttersprachliches Niveau</w:t>
@@ -1248,7 +1300,7 @@
           </w:tcPr>
           <w:p>
             <w:pPr>
-              <w:jc w:val="right"/>
+              <w:jc w:val="left"/>
             </w:pPr>
             <w:r>
               <w:t>Polnisch — kommunikativ</w:t>
@@ -1261,7 +1313,7 @@
           </w:tcPr>
           <w:p>
             <w:pPr>
-              <w:jc w:val="right"/>
+              <w:jc w:val="left"/>
             </w:pPr>
             <w:r>
               <w:t>Deutsch — B1, durch Zertifikat bestätigt</w:t>
@@ -1276,7 +1328,7 @@
           </w:tcPr>
           <w:p>
             <w:pPr>
-              <w:jc w:val="right"/>
+              <w:jc w:val="left"/>
             </w:pPr>
             <w:r>
               <w:t>Englisch — Grundkenntnisse.</w:t>
@@ -1686,7 +1738,7 @@
     <w:rsid w:val="00FC693F"/>
     <w:pPr>
       <w:spacing w:line="269" w:lineRule="auto" w:after="120"/>
-      <w:jc w:val="right"/>
+      <w:jc w:val="both"/>
     </w:pPr>
     <w:rPr>
       <w:rFonts w:ascii="Arial" w:hAnsi="Arial"/>
@@ -1750,7 +1802,7 @@
       <w:keepNext/>
       <w:keepLines/>
       <w:spacing w:before="260" w:after="140" w:line="269" w:lineRule="auto"/>
-      <w:jc w:val="right"/>
+      <w:jc w:val="left"/>
       <w:outlineLvl w:val="0"/>
     </w:pPr>
     <w:rPr>
@@ -1775,7 +1827,7 @@
       <w:keepNext/>
       <w:keepLines/>
       <w:spacing w:before="200" w:after="120" w:line="269" w:lineRule="auto"/>
-      <w:jc w:val="right"/>
+      <w:jc w:val="both"/>
       <w:outlineLvl w:val="1"/>
     </w:pPr>
     <w:rPr>
@@ -2040,7 +2092,7 @@
       <w:keepNext/>
       <w:spacing w:after="140" w:line="269" w:lineRule="auto"/>
       <w:contextualSpacing/>
-      <w:jc w:val="right"/>
+      <w:jc w:val="left"/>
     </w:pPr>
     <w:rPr>
       <w:rFonts w:asciiTheme="majorHAnsi" w:eastAsiaTheme="majorEastAsia" w:hAnsiTheme="majorHAnsi" w:cstheme="majorBidi" w:ascii="Arial" w:hAnsi="Arial"/>
@@ -2485,7 +2537,7 @@
     <w:pPr>
       <w:keepNext/>
       <w:spacing w:line="269" w:lineRule="auto" w:after="120"/>
-      <w:jc w:val="right"/>
+      <w:jc w:val="both"/>
     </w:pPr>
     <w:rPr>
       <w:rFonts w:ascii="Arial" w:hAnsi="Arial"/>

</xml_diff>

<commit_message>
Place professional practice and languages after CV membership
</commit_message>
<xml_diff>
--- a/dist/assets/documents/Krystyna-Mishchenko-CV-DE.docx
+++ b/dist/assets/documents/Krystyna-Mishchenko-CV-DE.docx
@@ -236,6 +236,256 @@
     <w:p>
       <w:r>
         <w:t>Seit August 2022 — Verband Polnischer Bildender Künstler (ZPAP), Warschau, Polen.</w:t>
+      </w:r>
+    </w:p>
+    <w:p>
+      <w:pPr>
+        <w:pStyle w:val="Heading1"/>
+      </w:pPr>
+      <w:r>
+        <w:t>BERUFLICHE PRAXIS</w:t>
+      </w:r>
+    </w:p>
+    <w:tbl>
+      <w:tblPr>
+        <w:tblW w:type="auto" w:w="0"/>
+        <w:tblLayout w:type="fixed"/>
+        <w:tblLook w:firstColumn="1" w:firstRow="1" w:lastColumn="0" w:lastRow="0" w:noHBand="0" w:noVBand="1" w:val="04A0"/>
+      </w:tblPr>
+      <w:tblGrid>
+        <w:gridCol w:w="1814"/>
+        <w:gridCol w:w="8050"/>
+      </w:tblGrid>
+      <w:tr>
+        <w:trPr>
+          <w:cantSplit/>
+        </w:trPr>
+        <w:tc>
+          <w:tcPr>
+            <w:tcW w:type="dxa" w:w="1814"/>
+          </w:tcPr>
+          <w:p>
+            <w:pPr>
+              <w:spacing w:after="100" w:line="254" w:lineRule="auto"/>
+              <w:jc w:val="right"/>
+            </w:pPr>
+            <w:r>
+              <w:rPr>
+                <w:b/>
+                <w:color w:val="666158"/>
+                <w:sz w:val="19"/>
+              </w:rPr>
+              <w:t>11.2020–02.2022</w:t>
+            </w:r>
+          </w:p>
+        </w:tc>
+        <w:tc>
+          <w:tcPr>
+            <w:tcW w:type="dxa" w:w="8050"/>
+          </w:tcPr>
+          <w:p>
+            <w:pPr>
+              <w:spacing w:after="100" w:line="254" w:lineRule="auto"/>
+              <w:jc w:val="both"/>
+            </w:pPr>
+            <w:r>
+              <w:rPr>
+                <w:sz w:val="20"/>
+              </w:rPr>
+              <w:t>SAGA POTTERY · Entwicklung künstlerischer Lösungen, dekorative Gestaltung keramischer Arbeiten sowie Arbeit mit Form, Oberflächenstruktur, Glasuren und Pigmenten.</w:t>
+            </w:r>
+          </w:p>
+        </w:tc>
+      </w:tr>
+      <w:tr>
+        <w:trPr>
+          <w:cantSplit/>
+        </w:trPr>
+        <w:tc>
+          <w:tcPr>
+            <w:tcW w:type="dxa" w:w="1814"/>
+          </w:tcPr>
+          <w:p>
+            <w:pPr>
+              <w:spacing w:after="100" w:line="254" w:lineRule="auto"/>
+              <w:jc w:val="right"/>
+            </w:pPr>
+            <w:r>
+              <w:rPr>
+                <w:b/>
+                <w:color w:val="666158"/>
+                <w:sz w:val="19"/>
+              </w:rPr>
+              <w:t>2018–2021</w:t>
+            </w:r>
+          </w:p>
+        </w:tc>
+        <w:tc>
+          <w:tcPr>
+            <w:tcW w:type="dxa" w:w="8050"/>
+          </w:tcPr>
+          <w:p>
+            <w:pPr>
+              <w:spacing w:after="100" w:line="254" w:lineRule="auto"/>
+              <w:jc w:val="both"/>
+            </w:pPr>
+            <w:r>
+              <w:rPr>
+                <w:sz w:val="20"/>
+              </w:rPr>
+              <w:t>PROCS · Entwicklung künstlerischer und dekorativer Lösungen, Organisation von Arbeitsabläufen, Teamkoordination, Zusammenarbeit mit Partnern und Lieferanten sowie Mitwirkung an der Mitarbeiterschulung.</w:t>
+            </w:r>
+          </w:p>
+        </w:tc>
+      </w:tr>
+      <w:tr>
+        <w:trPr>
+          <w:cantSplit/>
+        </w:trPr>
+        <w:tc>
+          <w:tcPr>
+            <w:tcW w:type="dxa" w:w="1814"/>
+          </w:tcPr>
+          <w:p>
+            <w:pPr>
+              <w:spacing w:after="100" w:line="254" w:lineRule="auto"/>
+              <w:jc w:val="right"/>
+            </w:pPr>
+            <w:r>
+              <w:rPr>
+                <w:b/>
+                <w:color w:val="666158"/>
+                <w:sz w:val="19"/>
+              </w:rPr>
+              <w:t>2020</w:t>
+            </w:r>
+          </w:p>
+        </w:tc>
+        <w:tc>
+          <w:tcPr>
+            <w:tcW w:type="dxa" w:w="8050"/>
+          </w:tcPr>
+          <w:p>
+            <w:pPr>
+              <w:spacing w:after="100" w:line="254" w:lineRule="auto"/>
+              <w:jc w:val="both"/>
+            </w:pPr>
+            <w:r>
+              <w:rPr>
+                <w:sz w:val="20"/>
+              </w:rPr>
+              <w:t>Studio Gozhar · Keramikkurse und Workshops für Kinder und Erwachsene, Entwicklung von Lernaufgaben und kreativen Übungen sowie Ausführung individueller künstlerischer Aufträge.</w:t>
+            </w:r>
+          </w:p>
+        </w:tc>
+      </w:tr>
+    </w:tbl>
+    <w:p>
+      <w:pPr>
+        <w:pStyle w:val="Heading1"/>
+      </w:pPr>
+      <w:r>
+        <w:t>SPRACHKENNTNISSE</w:t>
+      </w:r>
+    </w:p>
+    <w:tbl>
+      <w:tblPr>
+        <w:tblW w:type="auto" w:w="0"/>
+        <w:tblLook w:firstColumn="1" w:firstRow="1" w:lastColumn="0" w:lastRow="0" w:noHBand="0" w:noVBand="1" w:val="04A0"/>
+      </w:tblPr>
+      <w:tblGrid>
+        <w:gridCol w:w="4933"/>
+        <w:gridCol w:w="4933"/>
+      </w:tblGrid>
+      <w:tr>
+        <w:tc>
+          <w:tcPr>
+            <w:tcW w:type="dxa" w:w="4933"/>
+          </w:tcPr>
+          <w:p>
+            <w:pPr>
+              <w:jc w:val="left"/>
+            </w:pPr>
+            <w:r>
+              <w:t>Ukrainisch — Muttersprache</w:t>
+            </w:r>
+          </w:p>
+        </w:tc>
+        <w:tc>
+          <w:tcPr>
+            <w:tcW w:type="dxa" w:w="4933"/>
+          </w:tcPr>
+          <w:p>
+            <w:pPr>
+              <w:jc w:val="left"/>
+            </w:pPr>
+            <w:r>
+              <w:t>Russisch — muttersprachliches Niveau</w:t>
+            </w:r>
+          </w:p>
+        </w:tc>
+      </w:tr>
+      <w:tr>
+        <w:tc>
+          <w:tcPr>
+            <w:tcW w:type="dxa" w:w="4933"/>
+          </w:tcPr>
+          <w:p>
+            <w:pPr>
+              <w:jc w:val="left"/>
+            </w:pPr>
+            <w:r>
+              <w:t>Polnisch — kommunikativ</w:t>
+            </w:r>
+          </w:p>
+        </w:tc>
+        <w:tc>
+          <w:tcPr>
+            <w:tcW w:type="dxa" w:w="4933"/>
+          </w:tcPr>
+          <w:p>
+            <w:pPr>
+              <w:jc w:val="left"/>
+            </w:pPr>
+            <w:r>
+              <w:t>Deutsch — B1, durch Zertifikat bestätigt</w:t>
+            </w:r>
+          </w:p>
+        </w:tc>
+      </w:tr>
+      <w:tr>
+        <w:tc>
+          <w:tcPr>
+            <w:tcW w:type="dxa" w:w="4933"/>
+          </w:tcPr>
+          <w:p>
+            <w:pPr>
+              <w:jc w:val="left"/>
+            </w:pPr>
+            <w:r>
+              <w:t>Englisch — Grundkenntnisse.</w:t>
+            </w:r>
+          </w:p>
+        </w:tc>
+        <w:tc>
+          <w:tcPr>
+            <w:tcW w:type="dxa" w:w="4933"/>
+          </w:tcPr>
+          <w:p/>
+        </w:tc>
+      </w:tr>
+    </w:tbl>
+    <w:p>
+      <w:r>
+        <w:br w:type="page"/>
+      </w:r>
+    </w:p>
+    <w:p>
+      <w:pPr>
+        <w:pStyle w:val="Title"/>
+      </w:pPr>
+      <w:r>
+        <w:t>KRYSTYNA MISHCHENKO</w:t>
       </w:r>
     </w:p>
     <w:p>
@@ -521,38 +771,6 @@
           </w:p>
         </w:tc>
       </w:tr>
-    </w:tbl>
-    <w:p>
-      <w:r>
-        <w:br w:type="page"/>
-      </w:r>
-    </w:p>
-    <w:p>
-      <w:pPr>
-        <w:pStyle w:val="Title"/>
-      </w:pPr>
-      <w:r>
-        <w:t>KRYSTYNA MISHCHENKO</w:t>
-      </w:r>
-    </w:p>
-    <w:p>
-      <w:pPr>
-        <w:pStyle w:val="Heading1"/>
-      </w:pPr>
-      <w:r>
-        <w:t>AUSSTELLUNGEN FORTSETZUNG</w:t>
-      </w:r>
-    </w:p>
-    <w:tbl>
-      <w:tblPr>
-        <w:tblW w:type="auto" w:w="0"/>
-        <w:tblLayout w:type="fixed"/>
-        <w:tblLook w:firstColumn="1" w:firstRow="1" w:lastColumn="0" w:lastRow="0" w:noHBand="0" w:noVBand="1" w:val="04A0"/>
-      </w:tblPr>
-      <w:tblGrid>
-        <w:gridCol w:w="1814"/>
-        <w:gridCol w:w="8050"/>
-      </w:tblGrid>
       <w:tr>
         <w:trPr>
           <w:cantSplit/>
@@ -1106,243 +1324,6 @@
         </w:tc>
       </w:tr>
     </w:tbl>
-    <w:p>
-      <w:pPr>
-        <w:pStyle w:val="Heading1"/>
-      </w:pPr>
-      <w:r>
-        <w:t>BERUFLICHE PRAXIS</w:t>
-      </w:r>
-    </w:p>
-    <w:tbl>
-      <w:tblPr>
-        <w:tblW w:type="auto" w:w="0"/>
-        <w:tblLayout w:type="fixed"/>
-        <w:tblLook w:firstColumn="1" w:firstRow="1" w:lastColumn="0" w:lastRow="0" w:noHBand="0" w:noVBand="1" w:val="04A0"/>
-      </w:tblPr>
-      <w:tblGrid>
-        <w:gridCol w:w="1814"/>
-        <w:gridCol w:w="8050"/>
-      </w:tblGrid>
-      <w:tr>
-        <w:trPr>
-          <w:cantSplit/>
-        </w:trPr>
-        <w:tc>
-          <w:tcPr>
-            <w:tcW w:type="dxa" w:w="1814"/>
-          </w:tcPr>
-          <w:p>
-            <w:pPr>
-              <w:spacing w:after="100" w:line="254" w:lineRule="auto"/>
-              <w:jc w:val="right"/>
-            </w:pPr>
-            <w:r>
-              <w:rPr>
-                <w:b/>
-                <w:color w:val="666158"/>
-                <w:sz w:val="19"/>
-              </w:rPr>
-              <w:t>11.2020–02.2022</w:t>
-            </w:r>
-          </w:p>
-        </w:tc>
-        <w:tc>
-          <w:tcPr>
-            <w:tcW w:type="dxa" w:w="8050"/>
-          </w:tcPr>
-          <w:p>
-            <w:pPr>
-              <w:spacing w:after="100" w:line="254" w:lineRule="auto"/>
-              <w:jc w:val="both"/>
-            </w:pPr>
-            <w:r>
-              <w:rPr>
-                <w:sz w:val="20"/>
-              </w:rPr>
-              <w:t>SAGA POTTERY · Entwicklung künstlerischer Lösungen, dekorative Gestaltung keramischer Arbeiten sowie Arbeit mit Form, Oberflächenstruktur, Glasuren und Pigmenten.</w:t>
-            </w:r>
-          </w:p>
-        </w:tc>
-      </w:tr>
-      <w:tr>
-        <w:trPr>
-          <w:cantSplit/>
-        </w:trPr>
-        <w:tc>
-          <w:tcPr>
-            <w:tcW w:type="dxa" w:w="1814"/>
-          </w:tcPr>
-          <w:p>
-            <w:pPr>
-              <w:spacing w:after="100" w:line="254" w:lineRule="auto"/>
-              <w:jc w:val="right"/>
-            </w:pPr>
-            <w:r>
-              <w:rPr>
-                <w:b/>
-                <w:color w:val="666158"/>
-                <w:sz w:val="19"/>
-              </w:rPr>
-              <w:t>2018–2021</w:t>
-            </w:r>
-          </w:p>
-        </w:tc>
-        <w:tc>
-          <w:tcPr>
-            <w:tcW w:type="dxa" w:w="8050"/>
-          </w:tcPr>
-          <w:p>
-            <w:pPr>
-              <w:spacing w:after="100" w:line="254" w:lineRule="auto"/>
-              <w:jc w:val="both"/>
-            </w:pPr>
-            <w:r>
-              <w:rPr>
-                <w:sz w:val="20"/>
-              </w:rPr>
-              <w:t>PROCS · Entwicklung künstlerischer und dekorativer Lösungen, Organisation von Arbeitsabläufen, Teamkoordination, Zusammenarbeit mit Partnern und Lieferanten sowie Mitwirkung an der Mitarbeiterschulung.</w:t>
-            </w:r>
-          </w:p>
-        </w:tc>
-      </w:tr>
-      <w:tr>
-        <w:trPr>
-          <w:cantSplit/>
-        </w:trPr>
-        <w:tc>
-          <w:tcPr>
-            <w:tcW w:type="dxa" w:w="1814"/>
-          </w:tcPr>
-          <w:p>
-            <w:pPr>
-              <w:spacing w:after="100" w:line="254" w:lineRule="auto"/>
-              <w:jc w:val="right"/>
-            </w:pPr>
-            <w:r>
-              <w:rPr>
-                <w:b/>
-                <w:color w:val="666158"/>
-                <w:sz w:val="19"/>
-              </w:rPr>
-              <w:t>2020</w:t>
-            </w:r>
-          </w:p>
-        </w:tc>
-        <w:tc>
-          <w:tcPr>
-            <w:tcW w:type="dxa" w:w="8050"/>
-          </w:tcPr>
-          <w:p>
-            <w:pPr>
-              <w:spacing w:after="100" w:line="254" w:lineRule="auto"/>
-              <w:jc w:val="both"/>
-            </w:pPr>
-            <w:r>
-              <w:rPr>
-                <w:sz w:val="20"/>
-              </w:rPr>
-              <w:t>Studio Gozhar · Keramikkurse und Workshops für Kinder und Erwachsene, Entwicklung von Lernaufgaben und kreativen Übungen sowie Ausführung individueller künstlerischer Aufträge.</w:t>
-            </w:r>
-          </w:p>
-        </w:tc>
-      </w:tr>
-    </w:tbl>
-    <w:p>
-      <w:pPr>
-        <w:pStyle w:val="Heading1"/>
-      </w:pPr>
-      <w:r>
-        <w:t>SPRACHKENNTNISSE</w:t>
-      </w:r>
-    </w:p>
-    <w:tbl>
-      <w:tblPr>
-        <w:tblW w:type="auto" w:w="0"/>
-        <w:tblLook w:firstColumn="1" w:firstRow="1" w:lastColumn="0" w:lastRow="0" w:noHBand="0" w:noVBand="1" w:val="04A0"/>
-      </w:tblPr>
-      <w:tblGrid>
-        <w:gridCol w:w="4933"/>
-        <w:gridCol w:w="4933"/>
-      </w:tblGrid>
-      <w:tr>
-        <w:tc>
-          <w:tcPr>
-            <w:tcW w:type="dxa" w:w="4933"/>
-          </w:tcPr>
-          <w:p>
-            <w:pPr>
-              <w:jc w:val="left"/>
-            </w:pPr>
-            <w:r>
-              <w:t>Ukrainisch — Muttersprache</w:t>
-            </w:r>
-          </w:p>
-        </w:tc>
-        <w:tc>
-          <w:tcPr>
-            <w:tcW w:type="dxa" w:w="4933"/>
-          </w:tcPr>
-          <w:p>
-            <w:pPr>
-              <w:jc w:val="left"/>
-            </w:pPr>
-            <w:r>
-              <w:t>Russisch — muttersprachliches Niveau</w:t>
-            </w:r>
-          </w:p>
-        </w:tc>
-      </w:tr>
-      <w:tr>
-        <w:tc>
-          <w:tcPr>
-            <w:tcW w:type="dxa" w:w="4933"/>
-          </w:tcPr>
-          <w:p>
-            <w:pPr>
-              <w:jc w:val="left"/>
-            </w:pPr>
-            <w:r>
-              <w:t>Polnisch — kommunikativ</w:t>
-            </w:r>
-          </w:p>
-        </w:tc>
-        <w:tc>
-          <w:tcPr>
-            <w:tcW w:type="dxa" w:w="4933"/>
-          </w:tcPr>
-          <w:p>
-            <w:pPr>
-              <w:jc w:val="left"/>
-            </w:pPr>
-            <w:r>
-              <w:t>Deutsch — B1, durch Zertifikat bestätigt</w:t>
-            </w:r>
-          </w:p>
-        </w:tc>
-      </w:tr>
-      <w:tr>
-        <w:tc>
-          <w:tcPr>
-            <w:tcW w:type="dxa" w:w="4933"/>
-          </w:tcPr>
-          <w:p>
-            <w:pPr>
-              <w:jc w:val="left"/>
-            </w:pPr>
-            <w:r>
-              <w:t>Englisch — Grundkenntnisse.</w:t>
-            </w:r>
-          </w:p>
-        </w:tc>
-        <w:tc>
-          <w:tcPr>
-            <w:tcW w:type="dxa" w:w="4933"/>
-          </w:tcPr>
-          <w:p/>
-        </w:tc>
-      </w:tr>
-    </w:tbl>
     <w:sectPr>
       <w:footerReference w:type="default" r:id="rId9"/>
       <w:pgSz w:w="11906" w:h="16838"/>

</xml_diff>

<commit_message>
Reorder CV languages to Ukrainian Russian German Polish English
</commit_message>
<xml_diff>
--- a/dist/assets/documents/Krystyna-Mishchenko-CV-DE.docx
+++ b/dist/assets/documents/Krystyna-Mishchenko-CV-DE.docx
@@ -435,7 +435,7 @@
               <w:jc w:val="left"/>
             </w:pPr>
             <w:r>
-              <w:t>Polnisch — kommunikativ</w:t>
+              <w:t>Deutsch — B1, durch Zertifikat bestätigt</w:t>
             </w:r>
           </w:p>
         </w:tc>
@@ -448,7 +448,7 @@
               <w:jc w:val="left"/>
             </w:pPr>
             <w:r>
-              <w:t>Deutsch — B1, durch Zertifikat bestätigt</w:t>
+              <w:t>Polnisch — kommunikativ</w:t>
             </w:r>
           </w:p>
         </w:tc>

</xml_diff>